<commit_message>
Add Science and Engineering Ethics acceptance to news, research, and CV
Co-Authored-By: Claude Fable 5 <noreply@anthropic.com>
</commit_message>
<xml_diff>
--- a/assets/Lucken_CV.docx
+++ b/assets/Lucken_CV.docx
@@ -846,6 +846,23 @@
         <w:ind w:left="13"/>
       </w:pPr>
       <w:r>
+        <w:t>“An Identity-Based Ethics for Engineering,” Collin Lucken. Science and Engineering Ethics. (Forthcoming.)</w:t>
+      </w:r>
+    </w:p>
+    <w:p>
+      <w:pPr>
+        <w:spacing w:after="0" w:line="259" w:lineRule="auto"/>
+        <w:ind w:left="0"/>
+      </w:pPr>
+      <w:r>
+        <w:t xml:space="preserve"> </w:t>
+      </w:r>
+    </w:p>
+    <w:p>
+      <w:pPr>
+        <w:ind w:left="13"/>
+      </w:pPr>
+      <w:r>
         <w:t>“When Does the Body Matter? A Dynamical Signature of Coupling Dependence in Evolved Neural Controllers,” Collin Lucken. From Animals to Animats 18: Proceedings of the 18th International Conference on the Simulation of Adaptive Behavior (SAB 2026), Berlin, Germany. (Forthcoming.)</w:t>
       </w:r>
     </w:p>
@@ -1102,23 +1119,6 @@
       </w:pPr>
       <w:r>
         <w:t xml:space="preserve">“De-Intellectualizing Cognitive Change in Science” (Under Review. Draft Available) </w:t>
-      </w:r>
-    </w:p>
-    <w:p>
-      <w:pPr>
-        <w:spacing w:after="0" w:line="259" w:lineRule="auto"/>
-        <w:ind w:left="0"/>
-      </w:pPr>
-      <w:r>
-        <w:t xml:space="preserve"> </w:t>
-      </w:r>
-    </w:p>
-    <w:p>
-      <w:pPr>
-        <w:ind w:left="13"/>
-      </w:pPr>
-      <w:r>
-        <w:t xml:space="preserve">“An Identity-Based Ethics for Engineering” (Under Review. Draft Available) </w:t>
       </w:r>
     </w:p>
     <w:p>

</xml_diff>

<commit_message>
Update CV publications and rewrite teaching philosophy from current statement
Co-Authored-By: Claude Fable 5 <noreply@anthropic.com>
</commit_message>
<xml_diff>
--- a/assets/Lucken_CV.docx
+++ b/assets/Lucken_CV.docx
@@ -1067,24 +1067,24 @@
         <w:ind w:left="13"/>
       </w:pPr>
       <w:r>
-        <w:t xml:space="preserve">“Maker’s Knowledge and Scientific Understanding.” With Angela Potochnik. (Draft Available.) </w:t>
-      </w:r>
-    </w:p>
-    <w:p>
-      <w:pPr>
-        <w:spacing w:after="0" w:line="259" w:lineRule="auto"/>
-        <w:ind w:left="15"/>
-      </w:pPr>
-      <w:r>
-        <w:t xml:space="preserve"> </w:t>
-      </w:r>
-    </w:p>
-    <w:p>
-      <w:pPr>
-        <w:ind w:left="13"/>
-      </w:pPr>
-      <w:r>
-        <w:t xml:space="preserve">“The Erotetic Logic of William Whewell’s Fundamental Antithesis.” (Under Review. Draft available.) </w:t>
+        <w:t xml:space="preserve">“Scientific Works and the Transfer of Technique,” Collin Lucken. European Journal for Philosophy of Science. (Under Review.)</w:t>
+      </w:r>
+    </w:p>
+    <w:p>
+      <w:pPr>
+        <w:spacing w:after="0" w:line="259" w:lineRule="auto"/>
+        <w:ind w:left="0"/>
+      </w:pPr>
+      <w:r>
+        <w:t xml:space="preserve"> </w:t>
+      </w:r>
+    </w:p>
+    <w:p>
+      <w:pPr>
+        <w:ind w:left="13"/>
+      </w:pPr>
+      <w:r>
+        <w:t xml:space="preserve">“The Erotetic Logic of William Whewell’s Fundamental Antithesis,” Collin Lucken. Studies in History and Philosophy of Science. (Under Review; resubmitted after revision.)</w:t>
       </w:r>
     </w:p>
     <w:p>
@@ -1101,58 +1101,68 @@
         <w:ind w:left="13"/>
       </w:pPr>
       <w:r>
-        <w:t xml:space="preserve">“Mindshaping and Learner Centered Pedagogy: A Revealing Harmony” With W. John Koolage. (Under Review. Draft available) </w:t>
-      </w:r>
-    </w:p>
-    <w:p>
-      <w:pPr>
-        <w:spacing w:after="0" w:line="259" w:lineRule="auto"/>
-        <w:ind w:left="0"/>
-      </w:pPr>
-      <w:r>
-        <w:t xml:space="preserve"> </w:t>
-      </w:r>
-    </w:p>
-    <w:p>
-      <w:pPr>
-        <w:ind w:left="13"/>
-      </w:pPr>
-      <w:r>
-        <w:t xml:space="preserve">“De-Intellectualizing Cognitive Change in Science” (Under Review. Draft Available) </w:t>
-      </w:r>
-    </w:p>
-    <w:p>
-      <w:pPr>
-        <w:spacing w:after="0" w:line="259" w:lineRule="auto"/>
-        <w:ind w:left="0"/>
-      </w:pPr>
-      <w:r>
-        <w:t xml:space="preserve"> </w:t>
-      </w:r>
-    </w:p>
-    <w:p>
-      <w:pPr>
-        <w:ind w:left="13"/>
-      </w:pPr>
-      <w:r>
-        <w:t xml:space="preserve">“Framework Conventionalism and the Defense of Conceptual Engineering” (Under Review. Draft Available) </w:t>
-      </w:r>
-    </w:p>
-    <w:p>
-      <w:pPr>
-        <w:spacing w:after="0" w:line="259" w:lineRule="auto"/>
-        <w:ind w:left="0"/>
-      </w:pPr>
-      <w:r>
-        <w:t xml:space="preserve"> </w:t>
-      </w:r>
-    </w:p>
-    <w:p>
-      <w:pPr>
-        <w:ind w:left="13"/>
-      </w:pPr>
-      <w:r>
-        <w:t xml:space="preserve">“A Deflationary, Target-Relative Framework for Analyzing Scientific Progress” (Under Review. Draft Available) </w:t>
+        <w:t xml:space="preserve">“Mindshaping and Learner-Centered Pedagogy: A Revealing Harmony,” Collin Lucken and W. John Koolage. Teaching Philosophy. (Under Review; resubmitted after revision.)</w:t>
+      </w:r>
+    </w:p>
+    <w:p>
+      <w:pPr>
+        <w:spacing w:after="0" w:line="259" w:lineRule="auto"/>
+        <w:ind w:left="0"/>
+      </w:pPr>
+      <w:r>
+        <w:t xml:space="preserve"> </w:t>
+      </w:r>
+    </w:p>
+    <w:p>
+      <w:pPr>
+        <w:ind w:left="13"/>
+      </w:pPr>
+      <w:r>
+        <w:t xml:space="preserve">“Maker’s Knowledge in Science: Severity, Not Authorship,” Collin Lucken. (In Preparation.)</w:t>
+      </w:r>
+    </w:p>
+    <w:p>
+      <w:pPr>
+        <w:spacing w:after="0" w:line="259" w:lineRule="auto"/>
+        <w:ind w:left="0"/>
+      </w:pPr>
+      <w:r>
+        <w:t xml:space="preserve"> </w:t>
+      </w:r>
+    </w:p>
+    <w:p>
+      <w:pPr>
+        <w:ind w:left="13"/>
+      </w:pPr>
+      <w:r>
+        <w:t xml:space="preserve">“Maker’s Knowledge and Machine Learning,” Collin Lucken. (In Preparation.)</w:t>
+      </w:r>
+    </w:p>
+    <w:p>
+      <w:pPr>
+        <w:spacing w:after="0" w:line="259" w:lineRule="auto"/>
+        <w:ind w:left="0"/>
+      </w:pPr>
+      <w:r>
+        <w:t xml:space="preserve"> </w:t>
+      </w:r>
+    </w:p>
+    <w:p>
+      <w:pPr>
+        <w:spacing w:after="0" w:line="259" w:lineRule="auto"/>
+        <w:ind w:left="0"/>
+      </w:pPr>
+      <w:r>
+        <w:t xml:space="preserve"> </w:t>
+      </w:r>
+    </w:p>
+    <w:p>
+      <w:pPr>
+        <w:spacing w:after="0" w:line="259" w:lineRule="auto"/>
+        <w:ind w:left="0"/>
+      </w:pPr>
+      <w:r>
+        <w:t xml:space="preserve"> </w:t>
       </w:r>
     </w:p>
     <w:p>
@@ -1162,14 +1172,6 @@
       </w:pPr>
       <w:r>
         <w:t xml:space="preserve"> </w:t>
-      </w:r>
-    </w:p>
-    <w:p>
-      <w:pPr>
-        <w:ind w:left="13"/>
-      </w:pPr>
-      <w:r>
-        <w:t xml:space="preserve">“Modal Realism and the Simulation Argument” (Under Review. Draft Available) </w:t>
       </w:r>
     </w:p>
     <w:p>

</xml_diff>

<commit_message>
Rebuild research page around maker's knowledge and cognitive robotics
Add SAB, Whewell, Mindshaping, Scientific Works, and both maker's
knowledge papers with abstracts; regroup publications into Forthcoming,
Published, Under Review, In Preparation, and Under Contract.

Co-Authored-By: Claude Fable 5 <noreply@anthropic.com>
</commit_message>
<xml_diff>
--- a/assets/Lucken_CV.docx
+++ b/assets/Lucken_CV.docx
@@ -1118,24 +1118,24 @@
         <w:ind w:left="13"/>
       </w:pPr>
       <w:r>
-        <w:t xml:space="preserve">“Maker’s Knowledge in Science: Severity, Not Authorship,” Collin Lucken. (In Preparation.)</w:t>
-      </w:r>
-    </w:p>
-    <w:p>
-      <w:pPr>
-        <w:spacing w:after="0" w:line="259" w:lineRule="auto"/>
-        <w:ind w:left="0"/>
-      </w:pPr>
-      <w:r>
-        <w:t xml:space="preserve"> </w:t>
-      </w:r>
-    </w:p>
-    <w:p>
-      <w:pPr>
-        <w:ind w:left="13"/>
-      </w:pPr>
-      <w:r>
-        <w:t xml:space="preserve">“Maker’s Knowledge and Machine Learning,” Collin Lucken. (In Preparation.)</w:t>
+        <w:t xml:space="preserve">“Maker’s Knowledge in Science,” Collin Lucken. (In Preparation.)</w:t>
+      </w:r>
+    </w:p>
+    <w:p>
+      <w:pPr>
+        <w:spacing w:after="0" w:line="259" w:lineRule="auto"/>
+        <w:ind w:left="0"/>
+      </w:pPr>
+      <w:r>
+        <w:t xml:space="preserve"> </w:t>
+      </w:r>
+    </w:p>
+    <w:p>
+      <w:pPr>
+        <w:ind w:left="13"/>
+      </w:pPr>
+      <w:r>
+        <w:t xml:space="preserve">“Maker’s Knowledge in Machine Learning,” Collin Lucken. (In Preparation.)</w:t>
       </w:r>
     </w:p>
     <w:p>

</xml_diff>

<commit_message>
Update home, research, and teaching pages; refresh CV; add Teaching Philosophy news
Co-Authored-By: Claude Fable 5 <noreply@anthropic.com>
</commit_message>
<xml_diff>
--- a/assets/Lucken_CV.docx
+++ b/assets/Lucken_CV.docx
@@ -880,6 +880,23 @@
         <w:ind w:left="13"/>
       </w:pPr>
       <w:r>
+        <w:t>“Mindshaping and Learner-Centered Pedagogy: A Revealing Harmony,” Collin Lucken and W. John Koolage. Teaching Philosophy. (Forthcoming.)</w:t>
+      </w:r>
+    </w:p>
+    <w:p>
+      <w:pPr>
+        <w:spacing w:after="4" w:line="259" w:lineRule="auto"/>
+        <w:ind w:left="0"/>
+      </w:pPr>
+      <w:r>
+        <w:t xml:space="preserve"> </w:t>
+      </w:r>
+    </w:p>
+    <w:p>
+      <w:pPr>
+        <w:ind w:left="13"/>
+      </w:pPr>
+      <w:r>
         <w:t>“Leveraging participatory sense-making and public engagement with science for AI democratization” , Collin Lucken, Tim Elmo Feiten, Studies in History and Philosophy of Science, Volume 110, 2025, Pages 55-64, ISSN 0039-3681,</w:t>
       </w:r>
       <w:hyperlink r:id="rId6">
@@ -1085,23 +1102,6 @@
       </w:pPr>
       <w:r>
         <w:t xml:space="preserve">“The Erotetic Logic of William Whewell’s Fundamental Antithesis,” Collin Lucken. Studies in History and Philosophy of Science. (Under Review; resubmitted after revision.)</w:t>
-      </w:r>
-    </w:p>
-    <w:p>
-      <w:pPr>
-        <w:spacing w:after="4" w:line="259" w:lineRule="auto"/>
-        <w:ind w:left="0"/>
-      </w:pPr>
-      <w:r>
-        <w:t xml:space="preserve"> </w:t>
-      </w:r>
-    </w:p>
-    <w:p>
-      <w:pPr>
-        <w:ind w:left="13"/>
-      </w:pPr>
-      <w:r>
-        <w:t xml:space="preserve">“Mindshaping and Learner-Centered Pedagogy: A Revealing Harmony,” Collin Lucken and W. John Koolage. Teaching Philosophy. (Under Review; resubmitted after revision.)</w:t>
       </w:r>
     </w:p>
     <w:p>

</xml_diff>

<commit_message>
Update Whewell to forthcoming and transfer of technique to R&R
</commit_message>
<xml_diff>
--- a/assets/Lucken_CV.docx
+++ b/assets/Lucken_CV.docx
@@ -1084,24 +1084,24 @@
         <w:ind w:left="13"/>
       </w:pPr>
       <w:r>
-        <w:t xml:space="preserve">“Scientific Works and the Transfer of Technique,” Collin Lucken. European Journal for Philosophy of Science. (Under Review.)</w:t>
-      </w:r>
-    </w:p>
-    <w:p>
-      <w:pPr>
-        <w:spacing w:after="0" w:line="259" w:lineRule="auto"/>
-        <w:ind w:left="0"/>
-      </w:pPr>
-      <w:r>
-        <w:t xml:space="preserve"> </w:t>
-      </w:r>
-    </w:p>
-    <w:p>
-      <w:pPr>
-        <w:ind w:left="13"/>
-      </w:pPr>
-      <w:r>
-        <w:t xml:space="preserve">“The Erotetic Logic of William Whewell’s Fundamental Antithesis,” Collin Lucken. Studies in History and Philosophy of Science. (Under Review; resubmitted after revision.)</w:t>
+        <w:t xml:space="preserve">“Scientific Works and the Transfer of Technique,” Collin Lucken. European Journal for Philosophy of Science. (Revise and Resubmit.)</w:t>
+      </w:r>
+    </w:p>
+    <w:p>
+      <w:pPr>
+        <w:spacing w:after="0" w:line="259" w:lineRule="auto"/>
+        <w:ind w:left="0"/>
+      </w:pPr>
+      <w:r>
+        <w:t xml:space="preserve"> </w:t>
+      </w:r>
+    </w:p>
+    <w:p>
+      <w:pPr>
+        <w:ind w:left="13"/>
+      </w:pPr>
+      <w:r>
+        <w:t xml:space="preserve">“The Erotetic Logic of William Whewell’s Fundamental Antithesis,” Collin Lucken. Studies in History and Philosophy of Science. (Forthcoming.)</w:t>
       </w:r>
     </w:p>
     <w:p>

</xml_diff>

<commit_message>
Move the Whewell paper into Publication(s) as forthcoming
</commit_message>
<xml_diff>
--- a/assets/Lucken_CV.docx
+++ b/assets/Lucken_CV.docx
@@ -885,6 +885,23 @@
     </w:p>
     <w:p>
       <w:pPr>
+        <w:ind w:left="13"/>
+      </w:pPr>
+      <w:r>
+        <w:t xml:space="preserve">“The Erotetic Logic of William Whewell’s Fundamental Antithesis,” Collin Lucken. Studies in History and Philosophy of Science. (Forthcoming.)</w:t>
+      </w:r>
+    </w:p>
+    <w:p>
+      <w:pPr>
+        <w:spacing w:after="0" w:line="259" w:lineRule="auto"/>
+        <w:ind w:left="0"/>
+      </w:pPr>
+      <w:r>
+        <w:t xml:space="preserve"> </w:t>
+      </w:r>
+    </w:p>
+    <w:p>
+      <w:pPr>
         <w:spacing w:after="4" w:line="259" w:lineRule="auto"/>
         <w:ind w:left="0"/>
       </w:pPr>
@@ -1085,23 +1102,6 @@
       </w:pPr>
       <w:r>
         <w:t xml:space="preserve">“Scientific Works and the Transfer of Technique,” Collin Lucken. European Journal for Philosophy of Science. (Revise and Resubmit.)</w:t>
-      </w:r>
-    </w:p>
-    <w:p>
-      <w:pPr>
-        <w:spacing w:after="0" w:line="259" w:lineRule="auto"/>
-        <w:ind w:left="0"/>
-      </w:pPr>
-      <w:r>
-        <w:t xml:space="preserve"> </w:t>
-      </w:r>
-    </w:p>
-    <w:p>
-      <w:pPr>
-        <w:ind w:left="13"/>
-      </w:pPr>
-      <w:r>
-        <w:t xml:space="preserve">“The Erotetic Logic of William Whewell’s Fundamental Antithesis,” Collin Lucken. Studies in History and Philosophy of Science. (Forthcoming.)</w:t>
       </w:r>
     </w:p>
     <w:p>

</xml_diff>